<commit_message>
Refine methodology and final validation
</commit_message>
<xml_diff>
--- a/report/report.docx
+++ b/report/report.docx
@@ -128,7 +128,7 @@
           <w:color w:val="17212B"/>
           <w:sz w:val="20"/>
         </w:rPr>
-        <w:t>The strongest baseline risk-adjusted results were the Combined Maximum Sharpe fund (Sharpe 0.88) and Combined Risk Parity fund (0.87). The Crypto Minimum Variance fund achieved the highest annualised return (65.0%), but its 73.1% maximum drawdown makes it unsuitable to describe as conservative. Across all baseline funds, outcomes reflect the 2021–2023 historical sample rather than a promise of future performance.</w:t>
+        <w:t>Within the combined family, Maximum Sharpe (Sharpe 0.91) and Risk Parity (0.90) delivered the strongest risk-adjusted results. Crypto Minimum Variance achieved both the highest annualised return (65.0%) and the highest overall Sharpe (1.04), but its 73.1% maximum drawdown makes it unsuitable to describe as conservative. Across all baseline funds, outcomes reflect the 2021–2023 historical sample rather than a promise of future performance.</w:t>
       </w:r>
     </w:p>
     <w:p>
@@ -140,7 +140,7 @@
           <w:color w:val="17212B"/>
           <w:sz w:val="20"/>
         </w:rPr>
-        <w:t>I deliberately judged the sentiment extension against an untouched Equity Minimum Variance baseline rather than selecting a favourable comparator. The plain tilt reduced annualised return from 6.0% to 4.7% and Sharpe from 0.48 to 0.38. Coverage-aware reliability improved the tilted version to 5.0% return and 0.40 Sharpe, but still did not beat the base fund. I therefore retain sector sentiment as contextual evidence, not a buy/sell instruction.</w:t>
+        <w:t>I deliberately judged the sentiment extension against an untouched Equity Minimum Variance baseline rather than selecting a favourable comparator. The plain tilt reduced annualised return from 6.0% to 4.7% and Sharpe from 0.53 to 0.43. Coverage-aware reliability improved the tilted version to 5.0% return and 0.45 Sharpe, but still did not beat the base fund. I therefore retain sector sentiment as contextual evidence, not a buy/sell instruction.</w:t>
       </w:r>
     </w:p>
     <w:p>
@@ -258,7 +258,7 @@
           <w:color w:val="17212B"/>
           <w:sz w:val="20"/>
         </w:rPr>
-        <w:t>Zero transaction costs are used in the headline results, but one-way turnover is reported. This is material for Maximum Sharpe, whose average monthly turnover reached about 24% in equity and 25% in combined funds.</w:t>
+        <w:t>Zero transaction costs are used in the headline results, but one-way turnover is reported. This is material for Maximum Sharpe, whose average monthly rebalance turnover reached about 25% in equity and 25% in combined funds.</w:t>
       </w:r>
     </w:p>
     <w:p>
@@ -303,7 +303,7 @@
           <w:color w:val="17212B"/>
           <w:sz w:val="20"/>
         </w:rPr>
-        <w:t>I interpret the evidence as a trade-off rather than a universal winner. Combined Maximum Sharpe and Risk Parity delivered the strongest Sharpe ratios, while Combined Minimum Variance produced the lowest volatility (12.6%) and shallowest combined-fund drawdown (15.9%). The crypto funds occupied a different risk regime: annual volatility ranged from 75.0% to 80.4% and maximum drawdown from 73.1% to 82.1%.</w:t>
+        <w:t>I interpret the evidence as a trade-off rather than a universal winner. Within the combined family, Maximum Sharpe and Risk Parity delivered the strongest Sharpe ratios, while Combined Minimum Variance produced the lowest volatility (12.6%) and shallowest combined-fund drawdown (15.9%). Crypto Minimum Variance had the highest overall Sharpe, but the crypto funds occupied a different risk regime: annual volatility ranged from 75.0% to 80.4% and maximum drawdown from 73.1% to 82.1%.</w:t>
       </w:r>
     </w:p>
     <w:tbl>
@@ -601,7 +601,7 @@
                 <w:color w:val="17212B"/>
                 <w:sz w:val="14"/>
               </w:rPr>
-              <w:t>0.70</w:t>
+              <w:t>0.76</w:t>
             </w:r>
           </w:p>
         </w:tc>
@@ -765,7 +765,7 @@
                 <w:color w:val="17212B"/>
                 <w:sz w:val="14"/>
               </w:rPr>
-              <w:t>0.88</w:t>
+              <w:t>0.91</w:t>
             </w:r>
           </w:p>
         </w:tc>
@@ -819,7 +819,7 @@
                 <w:color w:val="17212B"/>
                 <w:sz w:val="14"/>
               </w:rPr>
-              <w:t>24.7%</w:t>
+              <w:t>25.4%</w:t>
             </w:r>
           </w:p>
         </w:tc>
@@ -929,7 +929,7 @@
                 <w:color w:val="17212B"/>
                 <w:sz w:val="14"/>
               </w:rPr>
-              <w:t>0.49</w:t>
+              <w:t>0.53</w:t>
             </w:r>
           </w:p>
         </w:tc>
@@ -983,7 +983,7 @@
                 <w:color w:val="17212B"/>
                 <w:sz w:val="14"/>
               </w:rPr>
-              <w:t>11.1%</w:t>
+              <w:t>11.4%</w:t>
             </w:r>
           </w:p>
         </w:tc>
@@ -1093,7 +1093,7 @@
                 <w:color w:val="17212B"/>
                 <w:sz w:val="14"/>
               </w:rPr>
-              <w:t>0.87</w:t>
+              <w:t>0.90</w:t>
             </w:r>
           </w:p>
         </w:tc>
@@ -1257,7 +1257,7 @@
                 <w:color w:val="17212B"/>
                 <w:sz w:val="14"/>
               </w:rPr>
-              <w:t>0.43</w:t>
+              <w:t>0.77</w:t>
             </w:r>
           </w:p>
         </w:tc>
@@ -1421,7 +1421,7 @@
                 <w:color w:val="17212B"/>
                 <w:sz w:val="14"/>
               </w:rPr>
-              <w:t>0.14</w:t>
+              <w:t>0.51</w:t>
             </w:r>
           </w:p>
         </w:tc>
@@ -1475,7 +1475,7 @@
                 <w:color w:val="17212B"/>
                 <w:sz w:val="14"/>
               </w:rPr>
-              <w:t>16.0%</w:t>
+              <w:t>16.5%</w:t>
             </w:r>
           </w:p>
         </w:tc>
@@ -1585,7 +1585,7 @@
                 <w:color w:val="17212B"/>
                 <w:sz w:val="14"/>
               </w:rPr>
-              <w:t>0.87</w:t>
+              <w:t>1.04</w:t>
             </w:r>
           </w:p>
         </w:tc>
@@ -1639,7 +1639,7 @@
                 <w:color w:val="17212B"/>
                 <w:sz w:val="14"/>
               </w:rPr>
-              <w:t>9.0%</w:t>
+              <w:t>9.3%</w:t>
             </w:r>
           </w:p>
         </w:tc>
@@ -1749,7 +1749,7 @@
                 <w:color w:val="17212B"/>
                 <w:sz w:val="14"/>
               </w:rPr>
-              <w:t>0.49</w:t>
+              <w:t>0.81</w:t>
             </w:r>
           </w:p>
         </w:tc>
@@ -1803,7 +1803,7 @@
                 <w:color w:val="17212B"/>
                 <w:sz w:val="14"/>
               </w:rPr>
-              <w:t>1.2%</w:t>
+              <w:t>1.3%</w:t>
             </w:r>
           </w:p>
         </w:tc>
@@ -1913,7 +1913,7 @@
                 <w:color w:val="17212B"/>
                 <w:sz w:val="14"/>
               </w:rPr>
-              <w:t>0.78</w:t>
+              <w:t>0.82</w:t>
             </w:r>
           </w:p>
         </w:tc>
@@ -2077,7 +2077,7 @@
                 <w:color w:val="17212B"/>
                 <w:sz w:val="14"/>
               </w:rPr>
-              <w:t>0.61</w:t>
+              <w:t>0.67</w:t>
             </w:r>
           </w:p>
         </w:tc>
@@ -2131,7 +2131,7 @@
                 <w:color w:val="17212B"/>
                 <w:sz w:val="14"/>
               </w:rPr>
-              <w:t>23.9%</w:t>
+              <w:t>24.6%</w:t>
             </w:r>
           </w:p>
         </w:tc>
@@ -2241,7 +2241,7 @@
                 <w:color w:val="17212B"/>
                 <w:sz w:val="14"/>
               </w:rPr>
-              <w:t>0.48</w:t>
+              <w:t>0.53</w:t>
             </w:r>
           </w:p>
         </w:tc>
@@ -2295,7 +2295,7 @@
                 <w:color w:val="17212B"/>
                 <w:sz w:val="14"/>
               </w:rPr>
-              <w:t>10.9%</w:t>
+              <w:t>11.3%</w:t>
             </w:r>
           </w:p>
         </w:tc>
@@ -2405,7 +2405,7 @@
                 <w:color w:val="17212B"/>
                 <w:sz w:val="14"/>
               </w:rPr>
-              <w:t>0.68</w:t>
+              <w:t>0.72</w:t>
             </w:r>
           </w:p>
         </w:tc>
@@ -2487,7 +2487,7 @@
           <w:color w:val="5B6573"/>
           <w:sz w:val="16"/>
         </w:rPr>
-        <w:t>Out-of-sample metrics by investable baseline fund. Return is compounded annual growth; risk is annualised standard deviation; Sharpe uses a zero risk-free rate; turnover is mean one-way turnover at monthly rebalances. Source: FINS5545 hosted data; author calculations.</w:t>
+        <w:t>Out-of-sample metrics by investable baseline fund. Return is compounded annual growth; risk is annualised standard deviation; Sharpe uses annualised arithmetic mean return, a zero risk-free rate and annualised volatility; turnover is mean one-way turnover at monthly rebalances. Source: FINS5545 hosted data; author calculations.</w:t>
       </w:r>
     </w:p>
     <w:p>
@@ -3376,7 +3376,7 @@
                 <w:color w:val="17212B"/>
                 <w:sz w:val="14"/>
               </w:rPr>
-              <w:t>0.40</w:t>
+              <w:t>0.45</w:t>
             </w:r>
           </w:p>
         </w:tc>
@@ -3540,7 +3540,7 @@
                 <w:color w:val="17212B"/>
                 <w:sz w:val="14"/>
               </w:rPr>
-              <w:t>0.48</w:t>
+              <w:t>0.53</w:t>
             </w:r>
           </w:p>
         </w:tc>
@@ -3594,7 +3594,7 @@
                 <w:color w:val="17212B"/>
                 <w:sz w:val="14"/>
               </w:rPr>
-              <w:t>10.9%</w:t>
+              <w:t>11.3%</w:t>
             </w:r>
           </w:p>
         </w:tc>
@@ -3704,7 +3704,7 @@
                 <w:color w:val="17212B"/>
                 <w:sz w:val="14"/>
               </w:rPr>
-              <w:t>0.38</w:t>
+              <w:t>0.43</w:t>
             </w:r>
           </w:p>
         </w:tc>
@@ -4472,7 +4472,7 @@
           <w:color w:val="17212B"/>
           <w:sz w:val="20"/>
         </w:rPr>
-        <w:t>Add implementation frictions before product launch. Model trading costs from reported turnover, cap fund-level crypto exposure for conservative presets, and add a paper-trading monitoring period. Maximum Sharpe's roughly 24–25% mean monthly turnover makes zero-cost performance especially optimistic.</w:t>
+        <w:t>Add implementation frictions before product launch. Model trading costs from reported turnover, cap fund-level crypto exposure for conservative presets, and add a paper-trading monitoring period. Maximum Sharpe's roughly 25% mean monthly rebalance turnover makes zero-cost performance especially optimistic.</w:t>
       </w:r>
     </w:p>
     <w:p>

</xml_diff>